<commit_message>
Repair package metadata and final journal document styling without changing content
</commit_message>
<xml_diff>
--- a/research/autonomy/continuation-2026-10-02/methylation-publication/outgoing/cover-letter.docx
+++ b/research/autonomy/continuation-2026-10-02/methylation-publication/outgoing/cover-letter.docx
@@ -503,7 +503,7 @@
       <w:outlineLvl w:val="0"/>
     </w:pPr>
     <w:rPr>
-      <w:rFonts w:asciiTheme="majorHAnsi" w:eastAsiaTheme="majorEastAsia" w:hAnsiTheme="majorHAnsi" w:cstheme="majorBidi" w:ascii="Times New Roman" w:hAnsi="Times New Roman"/>
+      <w:rFonts w:ascii="Times New Roman" w:hAnsi="Times New Roman"/>
       <w:b/>
       <w:bCs/>
       <w:color w:val="000000"/>
@@ -527,7 +527,7 @@
       <w:outlineLvl w:val="1"/>
     </w:pPr>
     <w:rPr>
-      <w:rFonts w:asciiTheme="majorHAnsi" w:eastAsiaTheme="majorEastAsia" w:hAnsiTheme="majorHAnsi" w:cstheme="majorBidi" w:ascii="Times New Roman" w:hAnsi="Times New Roman"/>
+      <w:rFonts w:ascii="Times New Roman" w:hAnsi="Times New Roman"/>
       <w:b/>
       <w:bCs/>
       <w:color w:val="000000"/>
@@ -551,7 +551,7 @@
       <w:outlineLvl w:val="2"/>
     </w:pPr>
     <w:rPr>
-      <w:rFonts w:asciiTheme="majorHAnsi" w:eastAsiaTheme="majorEastAsia" w:hAnsiTheme="majorHAnsi" w:cstheme="majorBidi" w:ascii="Times New Roman" w:hAnsi="Times New Roman"/>
+      <w:rFonts w:ascii="Times New Roman" w:hAnsi="Times New Roman"/>
       <w:b/>
       <w:bCs/>
       <w:color w:val="000000"/>
@@ -575,7 +575,7 @@
       <w:outlineLvl w:val="3"/>
     </w:pPr>
     <w:rPr>
-      <w:rFonts w:asciiTheme="majorHAnsi" w:eastAsiaTheme="majorEastAsia" w:hAnsiTheme="majorHAnsi" w:cstheme="majorBidi"/>
+      <w:rFonts/>
       <w:b/>
       <w:bCs/>
       <w:i/>
@@ -600,7 +600,7 @@
       <w:outlineLvl w:val="4"/>
     </w:pPr>
     <w:rPr>
-      <w:rFonts w:asciiTheme="majorHAnsi" w:eastAsiaTheme="majorEastAsia" w:hAnsiTheme="majorHAnsi" w:cstheme="majorBidi"/>
+      <w:rFonts/>
       <w:color w:val="243F60" w:themeColor="accent1" w:themeShade="7F"/>
     </w:rPr>
   </w:style>
@@ -621,7 +621,7 @@
       <w:outlineLvl w:val="5"/>
     </w:pPr>
     <w:rPr>
-      <w:rFonts w:asciiTheme="majorHAnsi" w:eastAsiaTheme="majorEastAsia" w:hAnsiTheme="majorHAnsi" w:cstheme="majorBidi"/>
+      <w:rFonts/>
       <w:i/>
       <w:iCs/>
       <w:color w:val="243F60" w:themeColor="accent1" w:themeShade="7F"/>
@@ -644,7 +644,7 @@
       <w:outlineLvl w:val="6"/>
     </w:pPr>
     <w:rPr>
-      <w:rFonts w:asciiTheme="majorHAnsi" w:eastAsiaTheme="majorEastAsia" w:hAnsiTheme="majorHAnsi" w:cstheme="majorBidi"/>
+      <w:rFonts/>
       <w:i/>
       <w:iCs/>
       <w:color w:val="404040" w:themeColor="text1" w:themeTint="BF"/>
@@ -667,7 +667,7 @@
       <w:outlineLvl w:val="7"/>
     </w:pPr>
     <w:rPr>
-      <w:rFonts w:asciiTheme="majorHAnsi" w:eastAsiaTheme="majorEastAsia" w:hAnsiTheme="majorHAnsi" w:cstheme="majorBidi"/>
+      <w:rFonts/>
       <w:color w:val="4F81BD" w:themeColor="accent1"/>
       <w:sz w:val="20"/>
       <w:szCs w:val="20"/>
@@ -690,7 +690,7 @@
       <w:outlineLvl w:val="8"/>
     </w:pPr>
     <w:rPr>
-      <w:rFonts w:asciiTheme="majorHAnsi" w:eastAsiaTheme="majorEastAsia" w:hAnsiTheme="majorHAnsi" w:cstheme="majorBidi"/>
+      <w:rFonts/>
       <w:i/>
       <w:iCs/>
       <w:color w:val="404040" w:themeColor="text1" w:themeTint="BF"/>
@@ -741,7 +741,7 @@
     <w:uiPriority w:val="9"/>
     <w:rsid w:val="00FC693F"/>
     <w:rPr>
-      <w:rFonts w:asciiTheme="majorHAnsi" w:eastAsiaTheme="majorEastAsia" w:hAnsiTheme="majorHAnsi" w:cstheme="majorBidi"/>
+      <w:rFonts/>
       <w:b/>
       <w:bCs/>
       <w:color w:val="365F91" w:themeColor="accent1" w:themeShade="BF"/>
@@ -756,7 +756,7 @@
     <w:uiPriority w:val="9"/>
     <w:rsid w:val="00FC693F"/>
     <w:rPr>
-      <w:rFonts w:asciiTheme="majorHAnsi" w:eastAsiaTheme="majorEastAsia" w:hAnsiTheme="majorHAnsi" w:cstheme="majorBidi"/>
+      <w:rFonts/>
       <w:b/>
       <w:bCs/>
       <w:color w:val="4F81BD" w:themeColor="accent1"/>
@@ -771,7 +771,7 @@
     <w:uiPriority w:val="9"/>
     <w:rsid w:val="00FC693F"/>
     <w:rPr>
-      <w:rFonts w:asciiTheme="majorHAnsi" w:eastAsiaTheme="majorEastAsia" w:hAnsiTheme="majorHAnsi" w:cstheme="majorBidi"/>
+      <w:rFonts/>
       <w:b/>
       <w:bCs/>
       <w:color w:val="4F81BD" w:themeColor="accent1"/>
@@ -787,14 +787,11 @@
     <w:rsid w:val="00FC693F"/>
     <w:pPr>
       <w:keepNext/>
-      <w:pBdr>
-        <w:bottom w:val="single" w:sz="8" w:space="4" w:color="4F81BD" w:themeColor="accent1"/>
-      </w:pBdr>
       <w:spacing w:after="100" w:line="240" w:lineRule="auto" w:before="200"/>
       <w:contextualSpacing/>
     </w:pPr>
     <w:rPr>
-      <w:rFonts w:asciiTheme="majorHAnsi" w:eastAsiaTheme="majorEastAsia" w:hAnsiTheme="majorHAnsi" w:cstheme="majorBidi" w:ascii="Times New Roman" w:hAnsi="Times New Roman"/>
+      <w:rFonts w:ascii="Times New Roman" w:hAnsi="Times New Roman"/>
       <w:b/>
       <w:color w:val="000000"/>
       <w:spacing w:val="5"/>
@@ -810,7 +807,7 @@
     <w:uiPriority w:val="10"/>
     <w:rsid w:val="00FC693F"/>
     <w:rPr>
-      <w:rFonts w:asciiTheme="majorHAnsi" w:eastAsiaTheme="majorEastAsia" w:hAnsiTheme="majorHAnsi" w:cstheme="majorBidi"/>
+      <w:rFonts/>
       <w:color w:val="17365D" w:themeColor="text2" w:themeShade="BF"/>
       <w:spacing w:val="5"/>
       <w:kern w:val="28"/>
@@ -832,7 +829,7 @@
       </w:numPr>
     </w:pPr>
     <w:rPr>
-      <w:rFonts w:asciiTheme="majorHAnsi" w:eastAsiaTheme="majorEastAsia" w:hAnsiTheme="majorHAnsi" w:cstheme="majorBidi"/>
+      <w:rFonts/>
       <w:i/>
       <w:iCs/>
       <w:color w:val="4F81BD" w:themeColor="accent1"/>
@@ -848,7 +845,7 @@
     <w:uiPriority w:val="11"/>
     <w:rsid w:val="00FC693F"/>
     <w:rPr>
-      <w:rFonts w:asciiTheme="majorHAnsi" w:eastAsiaTheme="majorEastAsia" w:hAnsiTheme="majorHAnsi" w:cstheme="majorBidi"/>
+      <w:rFonts/>
       <w:i/>
       <w:iCs/>
       <w:color w:val="4F81BD" w:themeColor="accent1"/>
@@ -1146,7 +1143,7 @@
     <w:semiHidden/>
     <w:rsid w:val="00FC693F"/>
     <w:rPr>
-      <w:rFonts w:asciiTheme="majorHAnsi" w:eastAsiaTheme="majorEastAsia" w:hAnsiTheme="majorHAnsi" w:cstheme="majorBidi"/>
+      <w:rFonts/>
       <w:b/>
       <w:bCs/>
       <w:i/>
@@ -1162,7 +1159,7 @@
     <w:semiHidden/>
     <w:rsid w:val="00FC693F"/>
     <w:rPr>
-      <w:rFonts w:asciiTheme="majorHAnsi" w:eastAsiaTheme="majorEastAsia" w:hAnsiTheme="majorHAnsi" w:cstheme="majorBidi"/>
+      <w:rFonts/>
       <w:color w:val="243F60" w:themeColor="accent1" w:themeShade="7F"/>
     </w:rPr>
   </w:style>
@@ -1174,7 +1171,7 @@
     <w:semiHidden/>
     <w:rsid w:val="00FC693F"/>
     <w:rPr>
-      <w:rFonts w:asciiTheme="majorHAnsi" w:eastAsiaTheme="majorEastAsia" w:hAnsiTheme="majorHAnsi" w:cstheme="majorBidi"/>
+      <w:rFonts/>
       <w:i/>
       <w:iCs/>
       <w:color w:val="243F60" w:themeColor="accent1" w:themeShade="7F"/>
@@ -1188,7 +1185,7 @@
     <w:semiHidden/>
     <w:rsid w:val="00FC693F"/>
     <w:rPr>
-      <w:rFonts w:asciiTheme="majorHAnsi" w:eastAsiaTheme="majorEastAsia" w:hAnsiTheme="majorHAnsi" w:cstheme="majorBidi"/>
+      <w:rFonts/>
       <w:i/>
       <w:iCs/>
       <w:color w:val="404040" w:themeColor="text1" w:themeTint="BF"/>
@@ -1202,7 +1199,7 @@
     <w:semiHidden/>
     <w:rsid w:val="00FC693F"/>
     <w:rPr>
-      <w:rFonts w:asciiTheme="majorHAnsi" w:eastAsiaTheme="majorEastAsia" w:hAnsiTheme="majorHAnsi" w:cstheme="majorBidi"/>
+      <w:rFonts/>
       <w:color w:val="4F81BD" w:themeColor="accent1"/>
       <w:sz w:val="20"/>
       <w:szCs w:val="20"/>
@@ -1216,7 +1213,7 @@
     <w:semiHidden/>
     <w:rsid w:val="00FC693F"/>
     <w:rPr>
-      <w:rFonts w:asciiTheme="majorHAnsi" w:eastAsiaTheme="majorEastAsia" w:hAnsiTheme="majorHAnsi" w:cstheme="majorBidi"/>
+      <w:rFonts/>
       <w:i/>
       <w:iCs/>
       <w:color w:val="404040" w:themeColor="text1" w:themeTint="BF"/>
@@ -1275,9 +1272,6 @@
     <w:qFormat/>
     <w:rsid w:val="00FC693F"/>
     <w:pPr>
-      <w:pBdr>
-        <w:bottom w:val="single" w:sz="4" w:space="4" w:color="4F81BD" w:themeColor="accent1"/>
-      </w:pBdr>
       <w:spacing w:before="200" w:after="280"/>
       <w:ind w:left="936" w:right="936"/>
     </w:pPr>
@@ -2805,7 +2799,7 @@
         <w:spacing w:before="0" w:after="0" w:line="240" w:lineRule="auto"/>
       </w:pPr>
       <w:rPr>
-        <w:rFonts w:asciiTheme="majorHAnsi" w:eastAsiaTheme="majorEastAsia" w:hAnsiTheme="majorHAnsi" w:cstheme="majorBidi"/>
+        <w:rFonts/>
         <w:b/>
         <w:bCs/>
       </w:rPr>
@@ -2826,7 +2820,7 @@
         <w:spacing w:before="0" w:after="0" w:line="240" w:lineRule="auto"/>
       </w:pPr>
       <w:rPr>
-        <w:rFonts w:asciiTheme="majorHAnsi" w:eastAsiaTheme="majorEastAsia" w:hAnsiTheme="majorHAnsi" w:cstheme="majorBidi"/>
+        <w:rFonts/>
         <w:b/>
         <w:bCs/>
       </w:rPr>
@@ -2844,14 +2838,14 @@
     </w:tblStylePr>
     <w:tblStylePr w:type="firstCol">
       <w:rPr>
-        <w:rFonts w:asciiTheme="majorHAnsi" w:eastAsiaTheme="majorEastAsia" w:hAnsiTheme="majorHAnsi" w:cstheme="majorBidi"/>
+        <w:rFonts/>
         <w:b/>
         <w:bCs/>
       </w:rPr>
     </w:tblStylePr>
     <w:tblStylePr w:type="lastCol">
       <w:rPr>
-        <w:rFonts w:asciiTheme="majorHAnsi" w:eastAsiaTheme="majorEastAsia" w:hAnsiTheme="majorHAnsi" w:cstheme="majorBidi"/>
+        <w:rFonts/>
         <w:b/>
         <w:bCs/>
       </w:rPr>
@@ -2935,7 +2929,7 @@
         <w:spacing w:before="0" w:after="0" w:line="240" w:lineRule="auto"/>
       </w:pPr>
       <w:rPr>
-        <w:rFonts w:asciiTheme="majorHAnsi" w:eastAsiaTheme="majorEastAsia" w:hAnsiTheme="majorHAnsi" w:cstheme="majorBidi"/>
+        <w:rFonts/>
         <w:b/>
         <w:bCs/>
       </w:rPr>
@@ -2956,7 +2950,7 @@
         <w:spacing w:before="0" w:after="0" w:line="240" w:lineRule="auto"/>
       </w:pPr>
       <w:rPr>
-        <w:rFonts w:asciiTheme="majorHAnsi" w:eastAsiaTheme="majorEastAsia" w:hAnsiTheme="majorHAnsi" w:cstheme="majorBidi"/>
+        <w:rFonts/>
         <w:b/>
         <w:bCs/>
       </w:rPr>
@@ -2974,14 +2968,14 @@
     </w:tblStylePr>
     <w:tblStylePr w:type="firstCol">
       <w:rPr>
-        <w:rFonts w:asciiTheme="majorHAnsi" w:eastAsiaTheme="majorEastAsia" w:hAnsiTheme="majorHAnsi" w:cstheme="majorBidi"/>
+        <w:rFonts/>
         <w:b/>
         <w:bCs/>
       </w:rPr>
     </w:tblStylePr>
     <w:tblStylePr w:type="lastCol">
       <w:rPr>
-        <w:rFonts w:asciiTheme="majorHAnsi" w:eastAsiaTheme="majorEastAsia" w:hAnsiTheme="majorHAnsi" w:cstheme="majorBidi"/>
+        <w:rFonts/>
         <w:b/>
         <w:bCs/>
       </w:rPr>
@@ -3065,7 +3059,7 @@
         <w:spacing w:before="0" w:after="0" w:line="240" w:lineRule="auto"/>
       </w:pPr>
       <w:rPr>
-        <w:rFonts w:asciiTheme="majorHAnsi" w:eastAsiaTheme="majorEastAsia" w:hAnsiTheme="majorHAnsi" w:cstheme="majorBidi"/>
+        <w:rFonts/>
         <w:b/>
         <w:bCs/>
       </w:rPr>
@@ -3086,7 +3080,7 @@
         <w:spacing w:before="0" w:after="0" w:line="240" w:lineRule="auto"/>
       </w:pPr>
       <w:rPr>
-        <w:rFonts w:asciiTheme="majorHAnsi" w:eastAsiaTheme="majorEastAsia" w:hAnsiTheme="majorHAnsi" w:cstheme="majorBidi"/>
+        <w:rFonts/>
         <w:b/>
         <w:bCs/>
       </w:rPr>
@@ -3104,14 +3098,14 @@
     </w:tblStylePr>
     <w:tblStylePr w:type="firstCol">
       <w:rPr>
-        <w:rFonts w:asciiTheme="majorHAnsi" w:eastAsiaTheme="majorEastAsia" w:hAnsiTheme="majorHAnsi" w:cstheme="majorBidi"/>
+        <w:rFonts/>
         <w:b/>
         <w:bCs/>
       </w:rPr>
     </w:tblStylePr>
     <w:tblStylePr w:type="lastCol">
       <w:rPr>
-        <w:rFonts w:asciiTheme="majorHAnsi" w:eastAsiaTheme="majorEastAsia" w:hAnsiTheme="majorHAnsi" w:cstheme="majorBidi"/>
+        <w:rFonts/>
         <w:b/>
         <w:bCs/>
       </w:rPr>
@@ -3195,7 +3189,7 @@
         <w:spacing w:before="0" w:after="0" w:line="240" w:lineRule="auto"/>
       </w:pPr>
       <w:rPr>
-        <w:rFonts w:asciiTheme="majorHAnsi" w:eastAsiaTheme="majorEastAsia" w:hAnsiTheme="majorHAnsi" w:cstheme="majorBidi"/>
+        <w:rFonts/>
         <w:b/>
         <w:bCs/>
       </w:rPr>
@@ -3216,7 +3210,7 @@
         <w:spacing w:before="0" w:after="0" w:line="240" w:lineRule="auto"/>
       </w:pPr>
       <w:rPr>
-        <w:rFonts w:asciiTheme="majorHAnsi" w:eastAsiaTheme="majorEastAsia" w:hAnsiTheme="majorHAnsi" w:cstheme="majorBidi"/>
+        <w:rFonts/>
         <w:b/>
         <w:bCs/>
       </w:rPr>
@@ -3234,14 +3228,14 @@
     </w:tblStylePr>
     <w:tblStylePr w:type="firstCol">
       <w:rPr>
-        <w:rFonts w:asciiTheme="majorHAnsi" w:eastAsiaTheme="majorEastAsia" w:hAnsiTheme="majorHAnsi" w:cstheme="majorBidi"/>
+        <w:rFonts/>
         <w:b/>
         <w:bCs/>
       </w:rPr>
     </w:tblStylePr>
     <w:tblStylePr w:type="lastCol">
       <w:rPr>
-        <w:rFonts w:asciiTheme="majorHAnsi" w:eastAsiaTheme="majorEastAsia" w:hAnsiTheme="majorHAnsi" w:cstheme="majorBidi"/>
+        <w:rFonts/>
         <w:b/>
         <w:bCs/>
       </w:rPr>
@@ -3325,7 +3319,7 @@
         <w:spacing w:before="0" w:after="0" w:line="240" w:lineRule="auto"/>
       </w:pPr>
       <w:rPr>
-        <w:rFonts w:asciiTheme="majorHAnsi" w:eastAsiaTheme="majorEastAsia" w:hAnsiTheme="majorHAnsi" w:cstheme="majorBidi"/>
+        <w:rFonts/>
         <w:b/>
         <w:bCs/>
       </w:rPr>
@@ -3346,7 +3340,7 @@
         <w:spacing w:before="0" w:after="0" w:line="240" w:lineRule="auto"/>
       </w:pPr>
       <w:rPr>
-        <w:rFonts w:asciiTheme="majorHAnsi" w:eastAsiaTheme="majorEastAsia" w:hAnsiTheme="majorHAnsi" w:cstheme="majorBidi"/>
+        <w:rFonts/>
         <w:b/>
         <w:bCs/>
       </w:rPr>
@@ -3364,14 +3358,14 @@
     </w:tblStylePr>
     <w:tblStylePr w:type="firstCol">
       <w:rPr>
-        <w:rFonts w:asciiTheme="majorHAnsi" w:eastAsiaTheme="majorEastAsia" w:hAnsiTheme="majorHAnsi" w:cstheme="majorBidi"/>
+        <w:rFonts/>
         <w:b/>
         <w:bCs/>
       </w:rPr>
     </w:tblStylePr>
     <w:tblStylePr w:type="lastCol">
       <w:rPr>
-        <w:rFonts w:asciiTheme="majorHAnsi" w:eastAsiaTheme="majorEastAsia" w:hAnsiTheme="majorHAnsi" w:cstheme="majorBidi"/>
+        <w:rFonts/>
         <w:b/>
         <w:bCs/>
       </w:rPr>
@@ -3455,7 +3449,7 @@
         <w:spacing w:before="0" w:after="0" w:line="240" w:lineRule="auto"/>
       </w:pPr>
       <w:rPr>
-        <w:rFonts w:asciiTheme="majorHAnsi" w:eastAsiaTheme="majorEastAsia" w:hAnsiTheme="majorHAnsi" w:cstheme="majorBidi"/>
+        <w:rFonts/>
         <w:b/>
         <w:bCs/>
       </w:rPr>
@@ -3476,7 +3470,7 @@
         <w:spacing w:before="0" w:after="0" w:line="240" w:lineRule="auto"/>
       </w:pPr>
       <w:rPr>
-        <w:rFonts w:asciiTheme="majorHAnsi" w:eastAsiaTheme="majorEastAsia" w:hAnsiTheme="majorHAnsi" w:cstheme="majorBidi"/>
+        <w:rFonts/>
         <w:b/>
         <w:bCs/>
       </w:rPr>
@@ -3494,14 +3488,14 @@
     </w:tblStylePr>
     <w:tblStylePr w:type="firstCol">
       <w:rPr>
-        <w:rFonts w:asciiTheme="majorHAnsi" w:eastAsiaTheme="majorEastAsia" w:hAnsiTheme="majorHAnsi" w:cstheme="majorBidi"/>
+        <w:rFonts/>
         <w:b/>
         <w:bCs/>
       </w:rPr>
     </w:tblStylePr>
     <w:tblStylePr w:type="lastCol">
       <w:rPr>
-        <w:rFonts w:asciiTheme="majorHAnsi" w:eastAsiaTheme="majorEastAsia" w:hAnsiTheme="majorHAnsi" w:cstheme="majorBidi"/>
+        <w:rFonts/>
         <w:b/>
         <w:bCs/>
       </w:rPr>
@@ -3585,7 +3579,7 @@
         <w:spacing w:before="0" w:after="0" w:line="240" w:lineRule="auto"/>
       </w:pPr>
       <w:rPr>
-        <w:rFonts w:asciiTheme="majorHAnsi" w:eastAsiaTheme="majorEastAsia" w:hAnsiTheme="majorHAnsi" w:cstheme="majorBidi"/>
+        <w:rFonts/>
         <w:b/>
         <w:bCs/>
       </w:rPr>
@@ -3606,7 +3600,7 @@
         <w:spacing w:before="0" w:after="0" w:line="240" w:lineRule="auto"/>
       </w:pPr>
       <w:rPr>
-        <w:rFonts w:asciiTheme="majorHAnsi" w:eastAsiaTheme="majorEastAsia" w:hAnsiTheme="majorHAnsi" w:cstheme="majorBidi"/>
+        <w:rFonts/>
         <w:b/>
         <w:bCs/>
       </w:rPr>
@@ -3624,14 +3618,14 @@
     </w:tblStylePr>
     <w:tblStylePr w:type="firstCol">
       <w:rPr>
-        <w:rFonts w:asciiTheme="majorHAnsi" w:eastAsiaTheme="majorEastAsia" w:hAnsiTheme="majorHAnsi" w:cstheme="majorBidi"/>
+        <w:rFonts/>
         <w:b/>
         <w:bCs/>
       </w:rPr>
     </w:tblStylePr>
     <w:tblStylePr w:type="lastCol">
       <w:rPr>
-        <w:rFonts w:asciiTheme="majorHAnsi" w:eastAsiaTheme="majorEastAsia" w:hAnsiTheme="majorHAnsi" w:cstheme="majorBidi"/>
+        <w:rFonts/>
         <w:b/>
         <w:bCs/>
       </w:rPr>
@@ -5496,7 +5490,7 @@
     </w:tblPr>
     <w:tblStylePr w:type="firstRow">
       <w:rPr>
-        <w:rFonts w:asciiTheme="majorHAnsi" w:eastAsiaTheme="majorEastAsia" w:hAnsiTheme="majorHAnsi" w:cstheme="majorBidi"/>
+        <w:rFonts/>
       </w:rPr>
       <w:tblPr/>
       <w:tcPr>
@@ -5580,7 +5574,7 @@
     </w:tblPr>
     <w:tblStylePr w:type="firstRow">
       <w:rPr>
-        <w:rFonts w:asciiTheme="majorHAnsi" w:eastAsiaTheme="majorEastAsia" w:hAnsiTheme="majorHAnsi" w:cstheme="majorBidi"/>
+        <w:rFonts/>
       </w:rPr>
       <w:tblPr/>
       <w:tcPr>
@@ -5664,7 +5658,7 @@
     </w:tblPr>
     <w:tblStylePr w:type="firstRow">
       <w:rPr>
-        <w:rFonts w:asciiTheme="majorHAnsi" w:eastAsiaTheme="majorEastAsia" w:hAnsiTheme="majorHAnsi" w:cstheme="majorBidi"/>
+        <w:rFonts/>
       </w:rPr>
       <w:tblPr/>
       <w:tcPr>
@@ -5748,7 +5742,7 @@
     </w:tblPr>
     <w:tblStylePr w:type="firstRow">
       <w:rPr>
-        <w:rFonts w:asciiTheme="majorHAnsi" w:eastAsiaTheme="majorEastAsia" w:hAnsiTheme="majorHAnsi" w:cstheme="majorBidi"/>
+        <w:rFonts/>
       </w:rPr>
       <w:tblPr/>
       <w:tcPr>
@@ -5832,7 +5826,7 @@
     </w:tblPr>
     <w:tblStylePr w:type="firstRow">
       <w:rPr>
-        <w:rFonts w:asciiTheme="majorHAnsi" w:eastAsiaTheme="majorEastAsia" w:hAnsiTheme="majorHAnsi" w:cstheme="majorBidi"/>
+        <w:rFonts/>
       </w:rPr>
       <w:tblPr/>
       <w:tcPr>
@@ -5916,7 +5910,7 @@
     </w:tblPr>
     <w:tblStylePr w:type="firstRow">
       <w:rPr>
-        <w:rFonts w:asciiTheme="majorHAnsi" w:eastAsiaTheme="majorEastAsia" w:hAnsiTheme="majorHAnsi" w:cstheme="majorBidi"/>
+        <w:rFonts/>
       </w:rPr>
       <w:tblPr/>
       <w:tcPr>
@@ -6000,7 +5994,7 @@
     </w:tblPr>
     <w:tblStylePr w:type="firstRow">
       <w:rPr>
-        <w:rFonts w:asciiTheme="majorHAnsi" w:eastAsiaTheme="majorEastAsia" w:hAnsiTheme="majorHAnsi" w:cstheme="majorBidi"/>
+        <w:rFonts/>
       </w:rPr>
       <w:tblPr/>
       <w:tcPr>
@@ -6065,7 +6059,7 @@
       <w:spacing w:after="0" w:line="240" w:lineRule="auto"/>
     </w:pPr>
     <w:rPr>
-      <w:rFonts w:asciiTheme="majorHAnsi" w:eastAsiaTheme="majorEastAsia" w:hAnsiTheme="majorHAnsi" w:cstheme="majorBidi"/>
+      <w:rFonts/>
       <w:color w:val="000000" w:themeColor="text1"/>
     </w:rPr>
     <w:tblPr>
@@ -6193,7 +6187,7 @@
       <w:spacing w:after="0" w:line="240" w:lineRule="auto"/>
     </w:pPr>
     <w:rPr>
-      <w:rFonts w:asciiTheme="majorHAnsi" w:eastAsiaTheme="majorEastAsia" w:hAnsiTheme="majorHAnsi" w:cstheme="majorBidi"/>
+      <w:rFonts/>
       <w:color w:val="000000" w:themeColor="text1"/>
     </w:rPr>
     <w:tblPr>
@@ -6321,7 +6315,7 @@
       <w:spacing w:after="0" w:line="240" w:lineRule="auto"/>
     </w:pPr>
     <w:rPr>
-      <w:rFonts w:asciiTheme="majorHAnsi" w:eastAsiaTheme="majorEastAsia" w:hAnsiTheme="majorHAnsi" w:cstheme="majorBidi"/>
+      <w:rFonts/>
       <w:color w:val="000000" w:themeColor="text1"/>
     </w:rPr>
     <w:tblPr>
@@ -6449,7 +6443,7 @@
       <w:spacing w:after="0" w:line="240" w:lineRule="auto"/>
     </w:pPr>
     <w:rPr>
-      <w:rFonts w:asciiTheme="majorHAnsi" w:eastAsiaTheme="majorEastAsia" w:hAnsiTheme="majorHAnsi" w:cstheme="majorBidi"/>
+      <w:rFonts/>
       <w:color w:val="000000" w:themeColor="text1"/>
     </w:rPr>
     <w:tblPr>
@@ -6577,7 +6571,7 @@
       <w:spacing w:after="0" w:line="240" w:lineRule="auto"/>
     </w:pPr>
     <w:rPr>
-      <w:rFonts w:asciiTheme="majorHAnsi" w:eastAsiaTheme="majorEastAsia" w:hAnsiTheme="majorHAnsi" w:cstheme="majorBidi"/>
+      <w:rFonts/>
       <w:color w:val="000000" w:themeColor="text1"/>
     </w:rPr>
     <w:tblPr>
@@ -6705,7 +6699,7 @@
       <w:spacing w:after="0" w:line="240" w:lineRule="auto"/>
     </w:pPr>
     <w:rPr>
-      <w:rFonts w:asciiTheme="majorHAnsi" w:eastAsiaTheme="majorEastAsia" w:hAnsiTheme="majorHAnsi" w:cstheme="majorBidi"/>
+      <w:rFonts/>
       <w:color w:val="000000" w:themeColor="text1"/>
     </w:rPr>
     <w:tblPr>
@@ -6833,7 +6827,7 @@
       <w:spacing w:after="0" w:line="240" w:lineRule="auto"/>
     </w:pPr>
     <w:rPr>
-      <w:rFonts w:asciiTheme="majorHAnsi" w:eastAsiaTheme="majorEastAsia" w:hAnsiTheme="majorHAnsi" w:cstheme="majorBidi"/>
+      <w:rFonts/>
       <w:color w:val="000000" w:themeColor="text1"/>
     </w:rPr>
     <w:tblPr>
@@ -7472,7 +7466,7 @@
       <w:spacing w:after="0" w:line="240" w:lineRule="auto"/>
     </w:pPr>
     <w:rPr>
-      <w:rFonts w:asciiTheme="majorHAnsi" w:eastAsiaTheme="majorEastAsia" w:hAnsiTheme="majorHAnsi" w:cstheme="majorBidi"/>
+      <w:rFonts/>
       <w:color w:val="000000" w:themeColor="text1"/>
     </w:rPr>
     <w:tblPr>
@@ -7597,7 +7591,7 @@
       <w:spacing w:after="0" w:line="240" w:lineRule="auto"/>
     </w:pPr>
     <w:rPr>
-      <w:rFonts w:asciiTheme="majorHAnsi" w:eastAsiaTheme="majorEastAsia" w:hAnsiTheme="majorHAnsi" w:cstheme="majorBidi"/>
+      <w:rFonts/>
       <w:color w:val="000000" w:themeColor="text1"/>
     </w:rPr>
     <w:tblPr>
@@ -7722,7 +7716,7 @@
       <w:spacing w:after="0" w:line="240" w:lineRule="auto"/>
     </w:pPr>
     <w:rPr>
-      <w:rFonts w:asciiTheme="majorHAnsi" w:eastAsiaTheme="majorEastAsia" w:hAnsiTheme="majorHAnsi" w:cstheme="majorBidi"/>
+      <w:rFonts/>
       <w:color w:val="000000" w:themeColor="text1"/>
     </w:rPr>
     <w:tblPr>
@@ -7847,7 +7841,7 @@
       <w:spacing w:after="0" w:line="240" w:lineRule="auto"/>
     </w:pPr>
     <w:rPr>
-      <w:rFonts w:asciiTheme="majorHAnsi" w:eastAsiaTheme="majorEastAsia" w:hAnsiTheme="majorHAnsi" w:cstheme="majorBidi"/>
+      <w:rFonts/>
       <w:color w:val="000000" w:themeColor="text1"/>
     </w:rPr>
     <w:tblPr>
@@ -7972,7 +7966,7 @@
       <w:spacing w:after="0" w:line="240" w:lineRule="auto"/>
     </w:pPr>
     <w:rPr>
-      <w:rFonts w:asciiTheme="majorHAnsi" w:eastAsiaTheme="majorEastAsia" w:hAnsiTheme="majorHAnsi" w:cstheme="majorBidi"/>
+      <w:rFonts/>
       <w:color w:val="000000" w:themeColor="text1"/>
     </w:rPr>
     <w:tblPr>
@@ -8097,7 +8091,7 @@
       <w:spacing w:after="0" w:line="240" w:lineRule="auto"/>
     </w:pPr>
     <w:rPr>
-      <w:rFonts w:asciiTheme="majorHAnsi" w:eastAsiaTheme="majorEastAsia" w:hAnsiTheme="majorHAnsi" w:cstheme="majorBidi"/>
+      <w:rFonts/>
       <w:color w:val="000000" w:themeColor="text1"/>
     </w:rPr>
     <w:tblPr>
@@ -8222,7 +8216,7 @@
       <w:spacing w:after="0" w:line="240" w:lineRule="auto"/>
     </w:pPr>
     <w:rPr>
-      <w:rFonts w:asciiTheme="majorHAnsi" w:eastAsiaTheme="majorEastAsia" w:hAnsiTheme="majorHAnsi" w:cstheme="majorBidi"/>
+      <w:rFonts/>
       <w:color w:val="000000" w:themeColor="text1"/>
     </w:rPr>
     <w:tblPr>

</xml_diff>